<commit_message>
actualizada situación de aprendizaje
</commit_message>
<xml_diff>
--- a/matematicas_2BACHCCSS/examenes/ctrl2_programacion.docx
+++ b/matematicas_2BACHCCSS/examenes/ctrl2_programacion.docx
@@ -396,7 +396,7 @@
                 <w:szCs w:val="24"/>
                 <w:lang w:eastAsia="es-ES"/>
               </w:rPr>
-              <w:t>14</w:t>
+              <w:t>11</w:t>
             </w:r>
             <w:r>
               <w:rPr>
@@ -417,7 +417,7 @@
                 <w:szCs w:val="24"/>
                 <w:lang w:eastAsia="es-ES"/>
               </w:rPr>
-              <w:t>Octubre</w:t>
+              <w:t>Noviembre</w:t>
             </w:r>
             <w:proofErr w:type="gramEnd"/>
             <w:r>
@@ -578,7 +578,7 @@
         <w:pStyle w:val="ListParagraph"/>
         <w:numPr>
           <w:ilvl w:val="0"/>
-          <w:numId w:val="14"/>
+          <w:numId w:val="17"/>
         </w:numPr>
         <w:rPr>
           <w:rFonts w:ascii="Arial" w:hAnsi="Arial" w:cs="Arial"/>
@@ -587,6 +587,52 @@
           <w:lang w:val="es-ES_tradnl"/>
         </w:rPr>
       </w:pPr>
+      <w:r>
+        <w:rPr>
+          <w:rFonts w:ascii="Arial" w:hAnsi="Arial" w:cs="Arial"/>
+          <w:sz w:val="28"/>
+          <w:szCs w:val="24"/>
+          <w:lang w:val="es-ES_tradnl"/>
+        </w:rPr>
+        <w:t>Dadas las siguientes restricciones:</w:t>
+      </w:r>
+    </w:p>
+    <w:p>
+      <w:pPr>
+        <w:rPr>
+          <w:rFonts w:ascii="Arial" w:hAnsi="Arial" w:cs="Arial"/>
+          <w:sz w:val="28"/>
+          <w:szCs w:val="24"/>
+          <w:lang w:val="es-ES_tradnl"/>
+        </w:rPr>
+      </w:pPr>
+      <w:r>
+        <w:rPr>
+          <w:rFonts w:ascii="Arial" w:hAnsi="Arial" w:cs="Arial"/>
+          <w:sz w:val="28"/>
+          <w:szCs w:val="24"/>
+          <w:lang w:val="es-ES_tradnl"/>
+        </w:rPr>
+        <w:t xml:space="preserve">x + y </w:t>
+      </w:r>
+      <w:r>
+        <w:rPr>
+          <w:rFonts w:ascii="Arial" w:hAnsi="Arial" w:cs="Arial"/>
+          <w:sz w:val="28"/>
+          <w:szCs w:val="24"/>
+          <w:lang w:val="es-ES_tradnl"/>
+        </w:rPr>
+        <w:t>≥</w:t>
+      </w:r>
+      <w:r>
+        <w:rPr>
+          <w:rFonts w:ascii="Arial" w:hAnsi="Arial" w:cs="Arial"/>
+          <w:sz w:val="28"/>
+          <w:szCs w:val="24"/>
+          <w:lang w:val="es-ES_tradnl"/>
+        </w:rPr>
+        <w:t xml:space="preserve"> </w:t>
+      </w:r>
       <w:proofErr w:type="gramStart"/>
       <w:r>
         <w:rPr>
@@ -595,36 +641,16 @@
           <w:szCs w:val="24"/>
           <w:lang w:val="es-ES_tradnl"/>
         </w:rPr>
-        <w:t xml:space="preserve">Este problema es de </w:t>
-      </w:r>
-      <w:r>
-        <w:rPr>
-          <w:rFonts w:ascii="Arial" w:hAnsi="Arial" w:cs="Arial"/>
-          <w:sz w:val="28"/>
-          <w:szCs w:val="24"/>
-          <w:lang w:val="es-ES_tradnl"/>
-        </w:rPr>
-        <w:t xml:space="preserve">programación o de sistemas de </w:t>
-      </w:r>
-      <w:proofErr w:type="spellStart"/>
-      <w:r>
-        <w:rPr>
-          <w:rFonts w:ascii="Arial" w:hAnsi="Arial" w:cs="Arial"/>
-          <w:sz w:val="28"/>
-          <w:szCs w:val="24"/>
-          <w:lang w:val="es-ES_tradnl"/>
-        </w:rPr>
-        <w:t>ecs</w:t>
-      </w:r>
-      <w:proofErr w:type="spellEnd"/>
-      <w:r>
-        <w:rPr>
-          <w:rFonts w:ascii="Arial" w:hAnsi="Arial" w:cs="Arial"/>
-          <w:sz w:val="28"/>
-          <w:szCs w:val="24"/>
-          <w:lang w:val="es-ES_tradnl"/>
-        </w:rPr>
-        <w:t>?</w:t>
+        <w:t xml:space="preserve">3; </w:t>
+      </w:r>
+      <w:r>
+        <w:rPr>
+          <w:rFonts w:ascii="Arial" w:hAnsi="Arial" w:cs="Arial"/>
+          <w:sz w:val="28"/>
+          <w:szCs w:val="24"/>
+          <w:lang w:val="es-ES_tradnl"/>
+        </w:rPr>
+        <w:t xml:space="preserve">  </w:t>
       </w:r>
       <w:proofErr w:type="gramEnd"/>
       <w:r>
@@ -634,6 +660,33 @@
           <w:szCs w:val="24"/>
           <w:lang w:val="es-ES_tradnl"/>
         </w:rPr>
+        <w:t xml:space="preserve">       </w:t>
+      </w:r>
+      <w:r>
+        <w:rPr>
+          <w:rFonts w:ascii="Arial" w:hAnsi="Arial" w:cs="Arial"/>
+          <w:sz w:val="28"/>
+          <w:szCs w:val="24"/>
+          <w:lang w:val="es-ES_tradnl"/>
+        </w:rPr>
+        <w:t xml:space="preserve">2x + y </w:t>
+      </w:r>
+      <w:r>
+        <w:rPr>
+          <w:rFonts w:ascii="Arial" w:hAnsi="Arial" w:cs="Arial"/>
+          <w:sz w:val="28"/>
+          <w:szCs w:val="24"/>
+          <w:lang w:val="es-ES_tradnl"/>
+        </w:rPr>
+        <w:t>≤</w:t>
+      </w:r>
+      <w:r>
+        <w:rPr>
+          <w:rFonts w:ascii="Arial" w:hAnsi="Arial" w:cs="Arial"/>
+          <w:sz w:val="28"/>
+          <w:szCs w:val="24"/>
+          <w:lang w:val="es-ES_tradnl"/>
+        </w:rPr>
         <w:t xml:space="preserve"> </w:t>
       </w:r>
       <w:proofErr w:type="gramStart"/>
@@ -644,7 +697,16 @@
           <w:szCs w:val="24"/>
           <w:lang w:val="es-ES_tradnl"/>
         </w:rPr>
-        <w:t>Dado</w:t>
+        <w:t xml:space="preserve">8; </w:t>
+      </w:r>
+      <w:r>
+        <w:rPr>
+          <w:rFonts w:ascii="Arial" w:hAnsi="Arial" w:cs="Arial"/>
+          <w:sz w:val="28"/>
+          <w:szCs w:val="24"/>
+          <w:lang w:val="es-ES_tradnl"/>
+        </w:rPr>
+        <w:t xml:space="preserve">  </w:t>
       </w:r>
       <w:proofErr w:type="gramEnd"/>
       <w:r>
@@ -654,15 +716,182 @@
           <w:szCs w:val="24"/>
           <w:lang w:val="es-ES_tradnl"/>
         </w:rPr>
-        <w:t xml:space="preserve"> un planteamiento, identifica las restricciones y la función objetivo.</w:t>
-      </w:r>
+        <w:t xml:space="preserve">       </w:t>
+      </w:r>
+      <w:r>
+        <w:rPr>
+          <w:rFonts w:ascii="Arial" w:hAnsi="Arial" w:cs="Arial"/>
+          <w:sz w:val="28"/>
+          <w:szCs w:val="24"/>
+          <w:lang w:val="es-ES_tradnl"/>
+        </w:rPr>
+        <w:t xml:space="preserve">x + 2y </w:t>
+      </w:r>
+      <w:r>
+        <w:rPr>
+          <w:rFonts w:ascii="Arial" w:hAnsi="Arial" w:cs="Arial"/>
+          <w:sz w:val="28"/>
+          <w:szCs w:val="24"/>
+          <w:lang w:val="es-ES_tradnl"/>
+        </w:rPr>
+        <w:t>≤</w:t>
+      </w:r>
+      <w:r>
+        <w:rPr>
+          <w:rFonts w:ascii="Arial" w:hAnsi="Arial" w:cs="Arial"/>
+          <w:sz w:val="28"/>
+          <w:szCs w:val="24"/>
+          <w:lang w:val="es-ES_tradnl"/>
+        </w:rPr>
+        <w:t xml:space="preserve"> </w:t>
+      </w:r>
+      <w:proofErr w:type="gramStart"/>
+      <w:r>
+        <w:rPr>
+          <w:rFonts w:ascii="Arial" w:hAnsi="Arial" w:cs="Arial"/>
+          <w:sz w:val="28"/>
+          <w:szCs w:val="24"/>
+          <w:lang w:val="es-ES_tradnl"/>
+        </w:rPr>
+        <w:t>10;</w:t>
+      </w:r>
+      <w:r>
+        <w:rPr>
+          <w:rFonts w:ascii="Arial" w:hAnsi="Arial" w:cs="Arial"/>
+          <w:sz w:val="28"/>
+          <w:szCs w:val="24"/>
+          <w:lang w:val="es-ES_tradnl"/>
+        </w:rPr>
+        <w:t xml:space="preserve">   </w:t>
+      </w:r>
+      <w:proofErr w:type="gramEnd"/>
+      <w:r>
+        <w:rPr>
+          <w:rFonts w:ascii="Arial" w:hAnsi="Arial" w:cs="Arial"/>
+          <w:sz w:val="28"/>
+          <w:szCs w:val="24"/>
+          <w:lang w:val="es-ES_tradnl"/>
+        </w:rPr>
+        <w:t xml:space="preserve">      </w:t>
+      </w:r>
+      <w:r>
+        <w:rPr>
+          <w:rFonts w:ascii="Arial" w:hAnsi="Arial" w:cs="Arial"/>
+          <w:sz w:val="28"/>
+          <w:szCs w:val="24"/>
+          <w:lang w:val="es-ES_tradnl"/>
+        </w:rPr>
+        <w:t xml:space="preserve"> </w:t>
+      </w:r>
+      <w:r>
+        <w:rPr>
+          <w:rFonts w:ascii="Arial" w:hAnsi="Arial" w:cs="Arial"/>
+          <w:sz w:val="28"/>
+          <w:szCs w:val="24"/>
+          <w:lang w:val="es-ES_tradnl"/>
+        </w:rPr>
+        <w:t xml:space="preserve">x </w:t>
+      </w:r>
+      <w:r>
+        <w:rPr>
+          <w:rFonts w:ascii="Arial" w:hAnsi="Arial" w:cs="Arial"/>
+          <w:sz w:val="28"/>
+          <w:szCs w:val="24"/>
+          <w:lang w:val="es-ES_tradnl"/>
+        </w:rPr>
+        <w:t>≥</w:t>
+      </w:r>
+      <w:r>
+        <w:rPr>
+          <w:rFonts w:ascii="Arial" w:hAnsi="Arial" w:cs="Arial"/>
+          <w:sz w:val="28"/>
+          <w:szCs w:val="24"/>
+          <w:lang w:val="es-ES_tradnl"/>
+        </w:rPr>
+        <w:t xml:space="preserve"> </w:t>
+      </w:r>
+      <w:proofErr w:type="gramStart"/>
+      <w:r>
+        <w:rPr>
+          <w:rFonts w:ascii="Arial" w:hAnsi="Arial" w:cs="Arial"/>
+          <w:sz w:val="28"/>
+          <w:szCs w:val="24"/>
+          <w:lang w:val="es-ES_tradnl"/>
+        </w:rPr>
+        <w:t xml:space="preserve">0; </w:t>
+      </w:r>
+      <w:r>
+        <w:rPr>
+          <w:rFonts w:ascii="Arial" w:hAnsi="Arial" w:cs="Arial"/>
+          <w:sz w:val="28"/>
+          <w:szCs w:val="24"/>
+          <w:lang w:val="es-ES_tradnl"/>
+        </w:rPr>
+        <w:t xml:space="preserve">  </w:t>
+      </w:r>
+      <w:proofErr w:type="gramEnd"/>
+      <w:r>
+        <w:rPr>
+          <w:rFonts w:ascii="Arial" w:hAnsi="Arial" w:cs="Arial"/>
+          <w:sz w:val="28"/>
+          <w:szCs w:val="24"/>
+          <w:lang w:val="es-ES_tradnl"/>
+        </w:rPr>
+        <w:t xml:space="preserve">       </w:t>
+      </w:r>
+      <w:r>
+        <w:rPr>
+          <w:rFonts w:ascii="Arial" w:hAnsi="Arial" w:cs="Arial"/>
+          <w:sz w:val="28"/>
+          <w:szCs w:val="24"/>
+          <w:lang w:val="es-ES_tradnl"/>
+        </w:rPr>
+        <w:t xml:space="preserve">y </w:t>
+      </w:r>
+      <w:r>
+        <w:rPr>
+          <w:rFonts w:ascii="Arial" w:hAnsi="Arial" w:cs="Arial"/>
+          <w:sz w:val="28"/>
+          <w:szCs w:val="24"/>
+          <w:lang w:val="es-ES_tradnl"/>
+        </w:rPr>
+        <w:t>≥</w:t>
+      </w:r>
+      <w:r>
+        <w:rPr>
+          <w:rFonts w:ascii="Arial" w:hAnsi="Arial" w:cs="Arial"/>
+          <w:sz w:val="28"/>
+          <w:szCs w:val="24"/>
+          <w:lang w:val="es-ES_tradnl"/>
+        </w:rPr>
+        <w:t xml:space="preserve"> </w:t>
+      </w:r>
+      <w:r>
+        <w:rPr>
+          <w:rFonts w:ascii="Arial" w:hAnsi="Arial" w:cs="Arial"/>
+          <w:sz w:val="28"/>
+          <w:szCs w:val="24"/>
+          <w:lang w:val="es-ES_tradnl"/>
+        </w:rPr>
+        <w:t>0</w:t>
+      </w:r>
+    </w:p>
+    <w:p>
+      <w:pPr>
+        <w:rPr>
+          <w:rFonts w:ascii="Arial" w:hAnsi="Arial" w:cs="Arial"/>
+          <w:sz w:val="28"/>
+          <w:szCs w:val="24"/>
+          <w:lang w:val="es-ES_tradnl"/>
+        </w:rPr>
+      </w:pPr>
     </w:p>
     <w:p>
       <w:pPr>
         <w:pStyle w:val="ListParagraph"/>
         <w:numPr>
           <w:ilvl w:val="0"/>
-          <w:numId w:val="14"/>
+          <w:numId w:val="18"/>
         </w:numPr>
         <w:rPr>
           <w:rFonts w:ascii="Arial" w:hAnsi="Arial" w:cs="Arial"/>
@@ -678,16 +907,29 @@
           <w:szCs w:val="24"/>
           <w:lang w:val="es-ES_tradnl"/>
         </w:rPr>
-        <w:t>Representa gráficamente las siguientes restricciones</w:t>
-      </w:r>
-      <w:r>
-        <w:rPr>
-          <w:rFonts w:ascii="Arial" w:hAnsi="Arial" w:cs="Arial"/>
-          <w:sz w:val="28"/>
-          <w:szCs w:val="24"/>
-          <w:lang w:val="es-ES_tradnl"/>
-        </w:rPr>
-        <w:t xml:space="preserve"> y el vector director correspondiente a la función objetivo.</w:t>
+        <w:t>Representa la Región Factible que definen.</w:t>
+      </w:r>
+      <w:r>
+        <w:rPr>
+          <w:rFonts w:ascii="Arial" w:hAnsi="Arial" w:cs="Arial"/>
+          <w:sz w:val="28"/>
+          <w:szCs w:val="24"/>
+          <w:lang w:val="es-ES_tradnl"/>
+        </w:rPr>
+        <w:t xml:space="preserve"> </w:t>
+      </w:r>
+      <w:r>
+        <w:rPr>
+          <w:rFonts w:ascii="Arial" w:hAnsi="Arial" w:cs="Arial"/>
+          <w:b/>
+          <w:bCs/>
+          <w:i/>
+          <w:iCs/>
+          <w:sz w:val="28"/>
+          <w:szCs w:val="24"/>
+          <w:lang w:val="es-ES_tradnl"/>
+        </w:rPr>
+        <w:t>(5 pt)</w:t>
       </w:r>
     </w:p>
     <w:p>
@@ -695,7 +937,7 @@
         <w:pStyle w:val="ListParagraph"/>
         <w:numPr>
           <w:ilvl w:val="0"/>
-          <w:numId w:val="14"/>
+          <w:numId w:val="18"/>
         </w:numPr>
         <w:rPr>
           <w:rFonts w:ascii="Arial" w:hAnsi="Arial" w:cs="Arial"/>
@@ -711,16 +953,29 @@
           <w:szCs w:val="24"/>
           <w:lang w:val="es-ES_tradnl"/>
         </w:rPr>
-        <w:t>Dada</w:t>
-      </w:r>
-      <w:r>
-        <w:rPr>
-          <w:rFonts w:ascii="Arial" w:hAnsi="Arial" w:cs="Arial"/>
-          <w:sz w:val="28"/>
-          <w:szCs w:val="24"/>
-          <w:lang w:val="es-ES_tradnl"/>
-        </w:rPr>
-        <w:t xml:space="preserve"> la representación gráfica de las siguientes restricciones y la función objetivo esta, halla los valores máximo y mínimo de la función objetivo.</w:t>
+        <w:t>Halla las coordenadas de todos los vértices de dicha región.</w:t>
+      </w:r>
+      <w:r>
+        <w:rPr>
+          <w:rFonts w:ascii="Arial" w:hAnsi="Arial" w:cs="Arial"/>
+          <w:sz w:val="28"/>
+          <w:szCs w:val="24"/>
+          <w:lang w:val="es-ES_tradnl"/>
+        </w:rPr>
+        <w:t xml:space="preserve"> </w:t>
+      </w:r>
+      <w:r>
+        <w:rPr>
+          <w:rFonts w:ascii="Arial" w:hAnsi="Arial" w:cs="Arial"/>
+          <w:b/>
+          <w:bCs/>
+          <w:i/>
+          <w:iCs/>
+          <w:sz w:val="28"/>
+          <w:szCs w:val="24"/>
+          <w:lang w:val="es-ES_tradnl"/>
+        </w:rPr>
+        <w:t>(5 pt)</w:t>
       </w:r>
     </w:p>
     <w:p>
@@ -728,7 +983,7 @@
         <w:pStyle w:val="ListParagraph"/>
         <w:numPr>
           <w:ilvl w:val="0"/>
-          <w:numId w:val="14"/>
+          <w:numId w:val="18"/>
         </w:numPr>
         <w:rPr>
           <w:rFonts w:ascii="Arial" w:hAnsi="Arial" w:cs="Arial"/>
@@ -737,6 +992,15 @@
           <w:lang w:val="es-ES_tradnl"/>
         </w:rPr>
       </w:pPr>
+      <w:r>
+        <w:rPr>
+          <w:rFonts w:ascii="Arial" w:hAnsi="Arial" w:cs="Arial"/>
+          <w:sz w:val="28"/>
+          <w:szCs w:val="24"/>
+          <w:lang w:val="es-ES_tradnl"/>
+        </w:rPr>
+        <w:t xml:space="preserve">Representa en la misma gráfica el Vector </w:t>
+      </w:r>
       <w:proofErr w:type="gramStart"/>
       <w:r>
         <w:rPr>
@@ -745,27 +1009,7 @@
           <w:szCs w:val="24"/>
           <w:lang w:val="es-ES_tradnl"/>
         </w:rPr>
-        <w:t xml:space="preserve">Este problema es de programación o de sistemas de </w:t>
-      </w:r>
-      <w:proofErr w:type="spellStart"/>
-      <w:r>
-        <w:rPr>
-          <w:rFonts w:ascii="Arial" w:hAnsi="Arial" w:cs="Arial"/>
-          <w:sz w:val="28"/>
-          <w:szCs w:val="24"/>
-          <w:lang w:val="es-ES_tradnl"/>
-        </w:rPr>
-        <w:t>ecs</w:t>
-      </w:r>
-      <w:proofErr w:type="spellEnd"/>
-      <w:r>
-        <w:rPr>
-          <w:rFonts w:ascii="Arial" w:hAnsi="Arial" w:cs="Arial"/>
-          <w:sz w:val="28"/>
-          <w:szCs w:val="24"/>
-          <w:lang w:val="es-ES_tradnl"/>
-        </w:rPr>
-        <w:t>?</w:t>
+        <w:t>Director</w:t>
       </w:r>
       <w:proofErr w:type="gramEnd"/>
       <w:r>
@@ -775,8 +1019,1036 @@
           <w:szCs w:val="24"/>
           <w:lang w:val="es-ES_tradnl"/>
         </w:rPr>
-        <w:t xml:space="preserve"> Saca el sistema de ecuaciones o ecuaciones correspondientes.</w:t>
-      </w:r>
+        <w:t xml:space="preserve"> </w:t>
+      </w:r>
+      <w:r>
+        <w:rPr>
+          <w:rFonts w:ascii="Arial" w:hAnsi="Arial" w:cs="Arial"/>
+          <w:sz w:val="28"/>
+          <w:szCs w:val="24"/>
+          <w:lang w:val="es-ES_tradnl"/>
+        </w:rPr>
+        <w:t xml:space="preserve">correspondiente a la Función Objetivo: </w:t>
+      </w:r>
+      <w:proofErr w:type="gramStart"/>
+      <w:r>
+        <w:rPr>
+          <w:rFonts w:ascii="Arial" w:hAnsi="Arial" w:cs="Arial"/>
+          <w:sz w:val="28"/>
+          <w:szCs w:val="24"/>
+          <w:lang w:val="es-ES_tradnl"/>
+        </w:rPr>
+        <w:t>f(</w:t>
+      </w:r>
+      <w:proofErr w:type="gramEnd"/>
+      <w:r>
+        <w:rPr>
+          <w:rFonts w:ascii="Arial" w:hAnsi="Arial" w:cs="Arial"/>
+          <w:sz w:val="28"/>
+          <w:szCs w:val="24"/>
+          <w:lang w:val="es-ES_tradnl"/>
+        </w:rPr>
+        <w:t>x, y) = 2x + 3y.</w:t>
+      </w:r>
+      <w:r>
+        <w:rPr>
+          <w:rFonts w:ascii="Arial" w:hAnsi="Arial" w:cs="Arial"/>
+          <w:sz w:val="28"/>
+          <w:szCs w:val="24"/>
+          <w:lang w:val="es-ES_tradnl"/>
+        </w:rPr>
+        <w:t xml:space="preserve"> </w:t>
+      </w:r>
+      <w:r>
+        <w:rPr>
+          <w:rFonts w:ascii="Arial" w:hAnsi="Arial" w:cs="Arial"/>
+          <w:b/>
+          <w:bCs/>
+          <w:i/>
+          <w:iCs/>
+          <w:sz w:val="28"/>
+          <w:szCs w:val="24"/>
+          <w:lang w:val="es-ES_tradnl"/>
+        </w:rPr>
+        <w:t>(</w:t>
+      </w:r>
+      <w:r>
+        <w:rPr>
+          <w:rFonts w:ascii="Arial" w:hAnsi="Arial" w:cs="Arial"/>
+          <w:b/>
+          <w:bCs/>
+          <w:i/>
+          <w:iCs/>
+          <w:sz w:val="28"/>
+          <w:szCs w:val="24"/>
+          <w:lang w:val="es-ES_tradnl"/>
+        </w:rPr>
+        <w:t>2</w:t>
+      </w:r>
+      <w:r>
+        <w:rPr>
+          <w:rFonts w:ascii="Arial" w:hAnsi="Arial" w:cs="Arial"/>
+          <w:b/>
+          <w:bCs/>
+          <w:i/>
+          <w:iCs/>
+          <w:sz w:val="28"/>
+          <w:szCs w:val="24"/>
+          <w:lang w:val="es-ES_tradnl"/>
+        </w:rPr>
+        <w:t xml:space="preserve"> pt)</w:t>
+      </w:r>
+    </w:p>
+    <w:p>
+      <w:pPr>
+        <w:pStyle w:val="ListParagraph"/>
+        <w:numPr>
+          <w:ilvl w:val="0"/>
+          <w:numId w:val="18"/>
+        </w:numPr>
+        <w:rPr>
+          <w:rFonts w:ascii="Arial" w:hAnsi="Arial" w:cs="Arial"/>
+          <w:sz w:val="28"/>
+          <w:szCs w:val="24"/>
+          <w:lang w:val="es-ES_tradnl"/>
+        </w:rPr>
+      </w:pPr>
+      <w:r>
+        <w:rPr>
+          <w:rFonts w:ascii="Arial" w:hAnsi="Arial" w:cs="Arial"/>
+          <w:sz w:val="28"/>
+          <w:szCs w:val="24"/>
+          <w:lang w:val="es-ES_tradnl"/>
+        </w:rPr>
+        <w:t xml:space="preserve">Halla </w:t>
+      </w:r>
+      <w:r>
+        <w:rPr>
+          <w:rFonts w:ascii="Arial" w:hAnsi="Arial" w:cs="Arial"/>
+          <w:sz w:val="28"/>
+          <w:szCs w:val="24"/>
+          <w:lang w:val="es-ES_tradnl"/>
+        </w:rPr>
+        <w:t xml:space="preserve">los valores máximo y mínimo de </w:t>
+      </w:r>
+      <w:proofErr w:type="gramStart"/>
+      <w:r>
+        <w:rPr>
+          <w:rFonts w:ascii="Arial" w:hAnsi="Arial" w:cs="Arial"/>
+          <w:sz w:val="28"/>
+          <w:szCs w:val="24"/>
+          <w:lang w:val="es-ES_tradnl"/>
+        </w:rPr>
+        <w:t>f(</w:t>
+      </w:r>
+      <w:proofErr w:type="gramEnd"/>
+      <w:r>
+        <w:rPr>
+          <w:rFonts w:ascii="Arial" w:hAnsi="Arial" w:cs="Arial"/>
+          <w:sz w:val="28"/>
+          <w:szCs w:val="24"/>
+          <w:lang w:val="es-ES_tradnl"/>
+        </w:rPr>
+        <w:t>x, y) e indica con qué valores de x e y corresponden.</w:t>
+      </w:r>
+      <w:r>
+        <w:rPr>
+          <w:rFonts w:ascii="Arial" w:hAnsi="Arial" w:cs="Arial"/>
+          <w:sz w:val="28"/>
+          <w:szCs w:val="24"/>
+          <w:lang w:val="es-ES_tradnl"/>
+        </w:rPr>
+        <w:t xml:space="preserve"> </w:t>
+      </w:r>
+      <w:r>
+        <w:rPr>
+          <w:rFonts w:ascii="Arial" w:hAnsi="Arial" w:cs="Arial"/>
+          <w:b/>
+          <w:bCs/>
+          <w:i/>
+          <w:iCs/>
+          <w:sz w:val="28"/>
+          <w:szCs w:val="24"/>
+          <w:lang w:val="es-ES_tradnl"/>
+        </w:rPr>
+        <w:t>(</w:t>
+      </w:r>
+      <w:r>
+        <w:rPr>
+          <w:rFonts w:ascii="Arial" w:hAnsi="Arial" w:cs="Arial"/>
+          <w:b/>
+          <w:bCs/>
+          <w:i/>
+          <w:iCs/>
+          <w:sz w:val="28"/>
+          <w:szCs w:val="24"/>
+          <w:lang w:val="es-ES_tradnl"/>
+        </w:rPr>
+        <w:t>4</w:t>
+      </w:r>
+      <w:r>
+        <w:rPr>
+          <w:rFonts w:ascii="Arial" w:hAnsi="Arial" w:cs="Arial"/>
+          <w:b/>
+          <w:bCs/>
+          <w:i/>
+          <w:iCs/>
+          <w:sz w:val="28"/>
+          <w:szCs w:val="24"/>
+          <w:lang w:val="es-ES_tradnl"/>
+        </w:rPr>
+        <w:t xml:space="preserve"> pt)</w:t>
+      </w:r>
+    </w:p>
+    <w:p>
+      <w:pPr>
+        <w:rPr>
+          <w:rFonts w:ascii="Arial" w:hAnsi="Arial" w:cs="Arial"/>
+          <w:sz w:val="28"/>
+          <w:szCs w:val="24"/>
+          <w:lang w:val="es-ES_tradnl"/>
+        </w:rPr>
+      </w:pPr>
+    </w:p>
+    <w:p>
+      <w:pPr>
+        <w:rPr>
+          <w:rFonts w:ascii="Arial" w:hAnsi="Arial" w:cs="Arial"/>
+          <w:sz w:val="28"/>
+          <w:szCs w:val="24"/>
+          <w:lang w:val="es-ES_tradnl"/>
+        </w:rPr>
+      </w:pPr>
+    </w:p>
+    <w:p>
+      <w:pPr>
+        <w:rPr>
+          <w:rFonts w:ascii="Arial" w:hAnsi="Arial" w:cs="Arial"/>
+          <w:sz w:val="28"/>
+          <w:szCs w:val="24"/>
+          <w:lang w:val="es-ES_tradnl"/>
+        </w:rPr>
+      </w:pPr>
+    </w:p>
+    <w:p>
+      <w:pPr>
+        <w:rPr>
+          <w:rFonts w:ascii="Arial" w:hAnsi="Arial" w:cs="Arial"/>
+          <w:sz w:val="28"/>
+          <w:szCs w:val="24"/>
+          <w:lang w:val="es-ES_tradnl"/>
+        </w:rPr>
+      </w:pPr>
+    </w:p>
+    <w:p>
+      <w:pPr>
+        <w:rPr>
+          <w:rFonts w:ascii="Arial" w:hAnsi="Arial" w:cs="Arial"/>
+          <w:sz w:val="28"/>
+          <w:szCs w:val="24"/>
+          <w:lang w:val="es-ES_tradnl"/>
+        </w:rPr>
+      </w:pPr>
+    </w:p>
+    <w:p>
+      <w:pPr>
+        <w:rPr>
+          <w:rFonts w:ascii="Arial" w:hAnsi="Arial" w:cs="Arial"/>
+          <w:sz w:val="28"/>
+          <w:szCs w:val="24"/>
+          <w:lang w:val="es-ES_tradnl"/>
+        </w:rPr>
+      </w:pPr>
+    </w:p>
+    <w:p>
+      <w:pPr>
+        <w:rPr>
+          <w:rFonts w:ascii="Arial" w:hAnsi="Arial" w:cs="Arial"/>
+          <w:sz w:val="28"/>
+          <w:szCs w:val="24"/>
+          <w:lang w:val="es-ES_tradnl"/>
+        </w:rPr>
+      </w:pPr>
+    </w:p>
+    <w:p>
+      <w:pPr>
+        <w:rPr>
+          <w:rFonts w:ascii="Arial" w:hAnsi="Arial" w:cs="Arial"/>
+          <w:sz w:val="28"/>
+          <w:szCs w:val="24"/>
+          <w:lang w:val="es-ES_tradnl"/>
+        </w:rPr>
+      </w:pPr>
+    </w:p>
+    <w:p>
+      <w:pPr>
+        <w:rPr>
+          <w:rFonts w:ascii="Arial" w:hAnsi="Arial" w:cs="Arial"/>
+          <w:sz w:val="28"/>
+          <w:szCs w:val="24"/>
+          <w:lang w:val="es-ES_tradnl"/>
+        </w:rPr>
+      </w:pPr>
+    </w:p>
+    <w:p>
+      <w:pPr>
+        <w:rPr>
+          <w:rFonts w:ascii="Arial" w:hAnsi="Arial" w:cs="Arial"/>
+          <w:sz w:val="28"/>
+          <w:szCs w:val="24"/>
+          <w:lang w:val="es-ES_tradnl"/>
+        </w:rPr>
+      </w:pPr>
+    </w:p>
+    <w:p>
+      <w:pPr>
+        <w:pStyle w:val="ListParagraph"/>
+        <w:numPr>
+          <w:ilvl w:val="0"/>
+          <w:numId w:val="17"/>
+        </w:numPr>
+        <w:rPr>
+          <w:rFonts w:ascii="Arial" w:hAnsi="Arial" w:cs="Arial"/>
+          <w:sz w:val="28"/>
+          <w:szCs w:val="24"/>
+          <w:lang w:val="es-ES_tradnl"/>
+        </w:rPr>
+      </w:pPr>
+      <w:r>
+        <w:rPr>
+          <w:rFonts w:ascii="Arial" w:hAnsi="Arial" w:cs="Arial"/>
+          <w:sz w:val="28"/>
+          <w:szCs w:val="24"/>
+          <w:lang w:val="es-ES_tradnl"/>
+        </w:rPr>
+        <w:lastRenderedPageBreak/>
+        <w:t xml:space="preserve">Indica si </w:t>
+      </w:r>
+      <w:r>
+        <w:rPr>
+          <w:rFonts w:ascii="Arial" w:hAnsi="Arial" w:cs="Arial"/>
+          <w:sz w:val="28"/>
+          <w:szCs w:val="24"/>
+          <w:lang w:val="es-ES_tradnl"/>
+        </w:rPr>
+        <w:t>los</w:t>
+      </w:r>
+      <w:r>
+        <w:rPr>
+          <w:rFonts w:ascii="Arial" w:hAnsi="Arial" w:cs="Arial"/>
+          <w:sz w:val="28"/>
+          <w:szCs w:val="24"/>
+          <w:lang w:val="es-ES_tradnl"/>
+        </w:rPr>
+        <w:t xml:space="preserve"> siguiente</w:t>
+      </w:r>
+      <w:r>
+        <w:rPr>
+          <w:rFonts w:ascii="Arial" w:hAnsi="Arial" w:cs="Arial"/>
+          <w:sz w:val="28"/>
+          <w:szCs w:val="24"/>
+          <w:lang w:val="es-ES_tradnl"/>
+        </w:rPr>
+        <w:t>s</w:t>
+      </w:r>
+      <w:r>
+        <w:rPr>
+          <w:rFonts w:ascii="Arial" w:hAnsi="Arial" w:cs="Arial"/>
+          <w:sz w:val="28"/>
+          <w:szCs w:val="24"/>
+          <w:lang w:val="es-ES_tradnl"/>
+        </w:rPr>
+        <w:t xml:space="preserve"> problema</w:t>
+      </w:r>
+      <w:r>
+        <w:rPr>
+          <w:rFonts w:ascii="Arial" w:hAnsi="Arial" w:cs="Arial"/>
+          <w:sz w:val="28"/>
+          <w:szCs w:val="24"/>
+          <w:lang w:val="es-ES_tradnl"/>
+        </w:rPr>
+        <w:t>s</w:t>
+      </w:r>
+      <w:r>
+        <w:rPr>
+          <w:rFonts w:ascii="Arial" w:hAnsi="Arial" w:cs="Arial"/>
+          <w:sz w:val="28"/>
+          <w:szCs w:val="24"/>
+          <w:lang w:val="es-ES_tradnl"/>
+        </w:rPr>
+        <w:t xml:space="preserve"> </w:t>
+      </w:r>
+      <w:r>
+        <w:rPr>
+          <w:rFonts w:ascii="Arial" w:hAnsi="Arial" w:cs="Arial"/>
+          <w:sz w:val="28"/>
+          <w:szCs w:val="24"/>
+          <w:lang w:val="es-ES_tradnl"/>
+        </w:rPr>
+        <w:t>son</w:t>
+      </w:r>
+      <w:r>
+        <w:rPr>
+          <w:rFonts w:ascii="Arial" w:hAnsi="Arial" w:cs="Arial"/>
+          <w:sz w:val="28"/>
+          <w:szCs w:val="24"/>
+          <w:lang w:val="es-ES_tradnl"/>
+        </w:rPr>
+        <w:t xml:space="preserve"> de Programación Lineal o de Sistemas de Ecuaciones.</w:t>
+      </w:r>
+      <w:r>
+        <w:rPr>
+          <w:rFonts w:ascii="Arial" w:hAnsi="Arial" w:cs="Arial"/>
+          <w:sz w:val="28"/>
+          <w:szCs w:val="24"/>
+          <w:lang w:val="es-ES_tradnl"/>
+        </w:rPr>
+        <w:t xml:space="preserve"> Para cada uno de ellos:</w:t>
+      </w:r>
+    </w:p>
+    <w:p>
+      <w:pPr>
+        <w:pStyle w:val="ListParagraph"/>
+        <w:rPr>
+          <w:rFonts w:ascii="Arial" w:hAnsi="Arial" w:cs="Arial"/>
+          <w:sz w:val="28"/>
+          <w:szCs w:val="24"/>
+          <w:lang w:val="es-ES_tradnl"/>
+        </w:rPr>
+      </w:pPr>
+    </w:p>
+    <w:p>
+      <w:pPr>
+        <w:pStyle w:val="ListParagraph"/>
+        <w:numPr>
+          <w:ilvl w:val="0"/>
+          <w:numId w:val="15"/>
+        </w:numPr>
+        <w:rPr>
+          <w:rFonts w:ascii="Arial" w:hAnsi="Arial" w:cs="Arial"/>
+          <w:sz w:val="28"/>
+          <w:szCs w:val="24"/>
+          <w:lang w:val="es-ES_tradnl"/>
+        </w:rPr>
+      </w:pPr>
+      <w:r>
+        <w:rPr>
+          <w:rFonts w:ascii="Arial" w:hAnsi="Arial" w:cs="Arial"/>
+          <w:sz w:val="28"/>
+          <w:szCs w:val="24"/>
+          <w:lang w:val="es-ES_tradnl"/>
+        </w:rPr>
+        <w:t>Si resulta ser de Programación Lineal: Etiqueta las variables, especifica las Restricciones y la Función Objetivo.</w:t>
+      </w:r>
+    </w:p>
+    <w:p>
+      <w:pPr>
+        <w:pStyle w:val="ListParagraph"/>
+        <w:ind w:left="1080"/>
+        <w:rPr>
+          <w:rFonts w:ascii="Arial" w:hAnsi="Arial" w:cs="Arial"/>
+          <w:sz w:val="28"/>
+          <w:szCs w:val="24"/>
+          <w:lang w:val="es-ES_tradnl"/>
+        </w:rPr>
+      </w:pPr>
+    </w:p>
+    <w:p>
+      <w:pPr>
+        <w:pStyle w:val="ListParagraph"/>
+        <w:numPr>
+          <w:ilvl w:val="0"/>
+          <w:numId w:val="15"/>
+        </w:numPr>
+        <w:rPr>
+          <w:rFonts w:ascii="Arial" w:hAnsi="Arial" w:cs="Arial"/>
+          <w:sz w:val="28"/>
+          <w:szCs w:val="24"/>
+          <w:lang w:val="es-ES_tradnl"/>
+        </w:rPr>
+      </w:pPr>
+      <w:r>
+        <w:rPr>
+          <w:rFonts w:ascii="Arial" w:hAnsi="Arial" w:cs="Arial"/>
+          <w:sz w:val="28"/>
+          <w:szCs w:val="24"/>
+          <w:lang w:val="es-ES_tradnl"/>
+        </w:rPr>
+        <w:t>Si resulta ser de Sistemas de Ecuaciones: Etiqueta las variables y especifica el Sistema de Ecuaciones.</w:t>
+      </w:r>
+    </w:p>
+    <w:p>
+      <w:pPr>
+        <w:pStyle w:val="ListParagraph"/>
+        <w:ind w:left="1080"/>
+        <w:rPr>
+          <w:rFonts w:ascii="Arial" w:hAnsi="Arial" w:cs="Arial"/>
+          <w:sz w:val="28"/>
+          <w:szCs w:val="24"/>
+          <w:lang w:val="es-ES_tradnl"/>
+        </w:rPr>
+      </w:pPr>
+    </w:p>
+    <w:p>
+      <w:pPr>
+        <w:pStyle w:val="ListParagraph"/>
+        <w:numPr>
+          <w:ilvl w:val="1"/>
+          <w:numId w:val="17"/>
+        </w:numPr>
+        <w:rPr>
+          <w:rFonts w:ascii="Arial" w:hAnsi="Arial" w:cs="Arial"/>
+          <w:sz w:val="28"/>
+          <w:szCs w:val="24"/>
+        </w:rPr>
+      </w:pPr>
+      <w:r>
+        <w:rPr>
+          <w:rFonts w:ascii="Arial" w:hAnsi="Arial" w:cs="Arial"/>
+          <w:sz w:val="28"/>
+          <w:szCs w:val="24"/>
+        </w:rPr>
+        <w:t>Se desea vender limonada y naranjada caseras en una verbena popular.</w:t>
+      </w:r>
+      <w:r>
+        <w:rPr>
+          <w:rFonts w:ascii="Arial" w:hAnsi="Arial" w:cs="Arial"/>
+          <w:sz w:val="28"/>
+          <w:szCs w:val="24"/>
+        </w:rPr>
+        <w:t xml:space="preserve"> </w:t>
+      </w:r>
+      <w:r>
+        <w:rPr>
+          <w:rFonts w:ascii="Arial" w:hAnsi="Arial" w:cs="Arial"/>
+          <w:sz w:val="28"/>
+          <w:szCs w:val="24"/>
+        </w:rPr>
+        <w:t>Además</w:t>
+      </w:r>
+      <w:r>
+        <w:rPr>
+          <w:rFonts w:ascii="Arial" w:hAnsi="Arial" w:cs="Arial"/>
+          <w:sz w:val="28"/>
+          <w:szCs w:val="24"/>
+        </w:rPr>
+        <w:t xml:space="preserve"> de agua, de la que disponemos sin limitaciones, cada litro de limonada necesita 4</w:t>
+      </w:r>
+      <w:r>
+        <w:rPr>
+          <w:rFonts w:ascii="Arial" w:hAnsi="Arial" w:cs="Arial"/>
+          <w:sz w:val="28"/>
+          <w:szCs w:val="24"/>
+        </w:rPr>
+        <w:t xml:space="preserve"> </w:t>
+      </w:r>
+      <w:r>
+        <w:rPr>
+          <w:rFonts w:ascii="Arial" w:hAnsi="Arial" w:cs="Arial"/>
+          <w:sz w:val="28"/>
+          <w:szCs w:val="24"/>
+        </w:rPr>
+        <w:t xml:space="preserve">limones y 80 gramos de </w:t>
+      </w:r>
+      <w:r>
+        <w:rPr>
+          <w:rFonts w:ascii="Arial" w:hAnsi="Arial" w:cs="Arial"/>
+          <w:sz w:val="28"/>
+          <w:szCs w:val="24"/>
+        </w:rPr>
+        <w:t>azúcar</w:t>
+      </w:r>
+      <w:r>
+        <w:rPr>
+          <w:rFonts w:ascii="Arial" w:hAnsi="Arial" w:cs="Arial"/>
+          <w:sz w:val="28"/>
+          <w:szCs w:val="24"/>
+        </w:rPr>
+        <w:t xml:space="preserve">. Cada litro de naranjada necesita 6 naranjas, 1 </w:t>
+      </w:r>
+      <w:r>
+        <w:rPr>
+          <w:rFonts w:ascii="Arial" w:hAnsi="Arial" w:cs="Arial"/>
+          <w:sz w:val="28"/>
+          <w:szCs w:val="24"/>
+        </w:rPr>
+        <w:t>limón</w:t>
+      </w:r>
+      <w:r>
+        <w:rPr>
+          <w:rFonts w:ascii="Arial" w:hAnsi="Arial" w:cs="Arial"/>
+          <w:sz w:val="28"/>
+          <w:szCs w:val="24"/>
+        </w:rPr>
+        <w:t xml:space="preserve"> y 50 gramos</w:t>
+      </w:r>
+      <w:r>
+        <w:rPr>
+          <w:rFonts w:ascii="Arial" w:hAnsi="Arial" w:cs="Arial"/>
+          <w:sz w:val="28"/>
+          <w:szCs w:val="24"/>
+        </w:rPr>
+        <w:t xml:space="preserve"> </w:t>
+      </w:r>
+      <w:r>
+        <w:rPr>
+          <w:rFonts w:ascii="Arial" w:hAnsi="Arial" w:cs="Arial"/>
+          <w:sz w:val="28"/>
+          <w:szCs w:val="24"/>
+        </w:rPr>
+        <w:t xml:space="preserve">de </w:t>
+      </w:r>
+      <w:r>
+        <w:rPr>
+          <w:rFonts w:ascii="Arial" w:hAnsi="Arial" w:cs="Arial"/>
+          <w:sz w:val="28"/>
+          <w:szCs w:val="24"/>
+        </w:rPr>
+        <w:t>azúcar</w:t>
+      </w:r>
+      <w:r>
+        <w:rPr>
+          <w:rFonts w:ascii="Arial" w:hAnsi="Arial" w:cs="Arial"/>
+          <w:sz w:val="28"/>
+          <w:szCs w:val="24"/>
+        </w:rPr>
+        <w:t xml:space="preserve">. Se dispone de 80 limones, 72 naranjas y 1720 gramos de </w:t>
+      </w:r>
+      <w:r>
+        <w:rPr>
+          <w:rFonts w:ascii="Arial" w:hAnsi="Arial" w:cs="Arial"/>
+          <w:sz w:val="28"/>
+          <w:szCs w:val="24"/>
+        </w:rPr>
+        <w:t>azúcar</w:t>
+      </w:r>
+      <w:r>
+        <w:rPr>
+          <w:rFonts w:ascii="Arial" w:hAnsi="Arial" w:cs="Arial"/>
+          <w:sz w:val="28"/>
+          <w:szCs w:val="24"/>
+        </w:rPr>
+        <w:t xml:space="preserve"> para la </w:t>
+      </w:r>
+      <w:r>
+        <w:rPr>
+          <w:rFonts w:ascii="Arial" w:hAnsi="Arial" w:cs="Arial"/>
+          <w:sz w:val="28"/>
+          <w:szCs w:val="24"/>
+        </w:rPr>
+        <w:t>elaboración</w:t>
+      </w:r>
+      <w:r>
+        <w:rPr>
+          <w:rFonts w:ascii="Arial" w:hAnsi="Arial" w:cs="Arial"/>
+          <w:sz w:val="28"/>
+          <w:szCs w:val="24"/>
+        </w:rPr>
+        <w:t>.</w:t>
+      </w:r>
+      <w:r>
+        <w:rPr>
+          <w:rFonts w:ascii="Arial" w:hAnsi="Arial" w:cs="Arial"/>
+          <w:sz w:val="28"/>
+          <w:szCs w:val="24"/>
+        </w:rPr>
+        <w:t xml:space="preserve"> </w:t>
+      </w:r>
+      <w:r>
+        <w:rPr>
+          <w:rFonts w:ascii="Arial" w:hAnsi="Arial" w:cs="Arial"/>
+          <w:sz w:val="28"/>
+          <w:szCs w:val="24"/>
+        </w:rPr>
+        <w:t xml:space="preserve">Cada litro de limonada se </w:t>
+      </w:r>
+      <w:r>
+        <w:rPr>
+          <w:rFonts w:ascii="Arial" w:hAnsi="Arial" w:cs="Arial"/>
+          <w:sz w:val="28"/>
+          <w:szCs w:val="24"/>
+        </w:rPr>
+        <w:t>venderá</w:t>
+      </w:r>
+      <w:r>
+        <w:rPr>
+          <w:rFonts w:ascii="Arial" w:hAnsi="Arial" w:cs="Arial"/>
+          <w:sz w:val="28"/>
+          <w:szCs w:val="24"/>
+        </w:rPr>
+        <w:t xml:space="preserve"> a 2 euros y cada litro de naranjada a 2,5 euros. Determine los</w:t>
+      </w:r>
+      <w:r>
+        <w:rPr>
+          <w:rFonts w:ascii="Arial" w:hAnsi="Arial" w:cs="Arial"/>
+          <w:sz w:val="28"/>
+          <w:szCs w:val="24"/>
+        </w:rPr>
+        <w:t xml:space="preserve"> </w:t>
+      </w:r>
+      <w:r>
+        <w:rPr>
+          <w:rFonts w:ascii="Arial" w:hAnsi="Arial" w:cs="Arial"/>
+          <w:sz w:val="28"/>
+          <w:szCs w:val="24"/>
+        </w:rPr>
+        <w:t>litros que se deben elaborar de cada una de las dos bebidas para maximizar los ingresos de la venta.</w:t>
+      </w:r>
+      <w:r>
+        <w:rPr>
+          <w:rFonts w:ascii="Arial" w:hAnsi="Arial" w:cs="Arial"/>
+          <w:sz w:val="28"/>
+          <w:szCs w:val="24"/>
+        </w:rPr>
+        <w:t xml:space="preserve"> </w:t>
+      </w:r>
+      <w:r>
+        <w:rPr>
+          <w:rFonts w:ascii="Arial" w:hAnsi="Arial" w:cs="Arial"/>
+          <w:b/>
+          <w:bCs/>
+          <w:i/>
+          <w:iCs/>
+          <w:sz w:val="28"/>
+          <w:szCs w:val="24"/>
+          <w:lang w:val="es-ES_tradnl"/>
+        </w:rPr>
+        <w:t>(5 pt)</w:t>
+      </w:r>
+    </w:p>
+    <w:p>
+      <w:pPr>
+        <w:pStyle w:val="ListParagraph"/>
+        <w:ind w:left="1440"/>
+        <w:rPr>
+          <w:rFonts w:ascii="Arial" w:hAnsi="Arial" w:cs="Arial"/>
+          <w:sz w:val="28"/>
+          <w:szCs w:val="24"/>
+        </w:rPr>
+      </w:pPr>
+    </w:p>
+    <w:p>
+      <w:pPr>
+        <w:pStyle w:val="ListParagraph"/>
+        <w:numPr>
+          <w:ilvl w:val="1"/>
+          <w:numId w:val="17"/>
+        </w:numPr>
+        <w:rPr>
+          <w:rFonts w:ascii="Arial" w:hAnsi="Arial" w:cs="Arial"/>
+          <w:sz w:val="28"/>
+          <w:szCs w:val="24"/>
+        </w:rPr>
+      </w:pPr>
+      <w:r>
+        <w:rPr>
+          <w:rFonts w:ascii="Arial" w:hAnsi="Arial" w:cs="Arial"/>
+          <w:sz w:val="28"/>
+          <w:szCs w:val="24"/>
+        </w:rPr>
+        <w:t xml:space="preserve">Hemos ido tres </w:t>
+      </w:r>
+      <w:r>
+        <w:rPr>
+          <w:rFonts w:ascii="Arial" w:hAnsi="Arial" w:cs="Arial"/>
+          <w:sz w:val="28"/>
+          <w:szCs w:val="24"/>
+        </w:rPr>
+        <w:t>días</w:t>
+      </w:r>
+      <w:r>
+        <w:rPr>
+          <w:rFonts w:ascii="Arial" w:hAnsi="Arial" w:cs="Arial"/>
+          <w:sz w:val="28"/>
+          <w:szCs w:val="24"/>
+        </w:rPr>
+        <w:t xml:space="preserve"> seguidos al bar de la Universidad. El primer</w:t>
+      </w:r>
+      <w:r>
+        <w:rPr>
+          <w:rFonts w:ascii="Arial" w:hAnsi="Arial" w:cs="Arial"/>
+          <w:sz w:val="28"/>
+          <w:szCs w:val="24"/>
+        </w:rPr>
+        <w:t xml:space="preserve"> </w:t>
+      </w:r>
+      <w:r>
+        <w:rPr>
+          <w:rFonts w:ascii="Arial" w:hAnsi="Arial" w:cs="Arial"/>
+          <w:sz w:val="28"/>
+          <w:szCs w:val="24"/>
+        </w:rPr>
+        <w:t>d</w:t>
+      </w:r>
+      <w:r>
+        <w:rPr>
+          <w:rFonts w:ascii="Arial" w:hAnsi="Arial" w:cs="Arial"/>
+          <w:sz w:val="28"/>
+          <w:szCs w:val="24"/>
+        </w:rPr>
+        <w:t>ía</w:t>
+      </w:r>
+      <w:r>
+        <w:rPr>
+          <w:rFonts w:ascii="Arial" w:hAnsi="Arial" w:cs="Arial"/>
+          <w:sz w:val="28"/>
+          <w:szCs w:val="24"/>
+        </w:rPr>
+        <w:t xml:space="preserve"> tomamos 3 </w:t>
+      </w:r>
+      <w:r>
+        <w:rPr>
+          <w:rFonts w:ascii="Arial" w:hAnsi="Arial" w:cs="Arial"/>
+          <w:sz w:val="28"/>
+          <w:szCs w:val="24"/>
+        </w:rPr>
+        <w:t>cafés</w:t>
+      </w:r>
+      <w:r>
+        <w:rPr>
+          <w:rFonts w:ascii="Arial" w:hAnsi="Arial" w:cs="Arial"/>
+          <w:sz w:val="28"/>
+          <w:szCs w:val="24"/>
+        </w:rPr>
+        <w:t>, 2 refrescos de cola y 3 batidos de cacao, el precio fue de 7 euros. El segundo</w:t>
+      </w:r>
+      <w:r>
+        <w:rPr>
+          <w:rFonts w:ascii="Arial" w:hAnsi="Arial" w:cs="Arial"/>
+          <w:sz w:val="28"/>
+          <w:szCs w:val="24"/>
+        </w:rPr>
+        <w:t xml:space="preserve"> </w:t>
+      </w:r>
+      <w:r>
+        <w:rPr>
+          <w:rFonts w:ascii="Arial" w:hAnsi="Arial" w:cs="Arial"/>
+          <w:sz w:val="28"/>
+          <w:szCs w:val="24"/>
+        </w:rPr>
+        <w:t>d</w:t>
+      </w:r>
+      <w:r>
+        <w:rPr>
+          <w:rFonts w:ascii="Arial" w:hAnsi="Arial" w:cs="Arial"/>
+          <w:sz w:val="28"/>
+          <w:szCs w:val="24"/>
+        </w:rPr>
+        <w:t>í</w:t>
+      </w:r>
+      <w:r>
+        <w:rPr>
+          <w:rFonts w:ascii="Arial" w:hAnsi="Arial" w:cs="Arial"/>
+          <w:sz w:val="28"/>
+          <w:szCs w:val="24"/>
+        </w:rPr>
+        <w:t xml:space="preserve">a tomamos 1 </w:t>
+      </w:r>
+      <w:r>
+        <w:rPr>
+          <w:rFonts w:ascii="Arial" w:hAnsi="Arial" w:cs="Arial"/>
+          <w:sz w:val="28"/>
+          <w:szCs w:val="24"/>
+        </w:rPr>
+        <w:t>café</w:t>
+      </w:r>
+      <w:r>
+        <w:rPr>
+          <w:rFonts w:ascii="Arial" w:hAnsi="Arial" w:cs="Arial"/>
+          <w:sz w:val="28"/>
+          <w:szCs w:val="24"/>
+        </w:rPr>
+        <w:t>, 2 refrescos de cola y 2 batidos de cacao, el precio total fue de 5 euros. Por</w:t>
+      </w:r>
+      <w:r>
+        <w:rPr>
+          <w:rFonts w:ascii="Arial" w:hAnsi="Arial" w:cs="Arial"/>
+          <w:sz w:val="28"/>
+          <w:szCs w:val="24"/>
+        </w:rPr>
+        <w:t xml:space="preserve"> </w:t>
+      </w:r>
+      <w:r>
+        <w:rPr>
+          <w:rFonts w:ascii="Arial" w:hAnsi="Arial" w:cs="Arial"/>
+          <w:sz w:val="28"/>
+          <w:szCs w:val="24"/>
+        </w:rPr>
+        <w:t>último</w:t>
+      </w:r>
+      <w:r>
+        <w:rPr>
+          <w:rFonts w:ascii="Arial" w:hAnsi="Arial" w:cs="Arial"/>
+          <w:sz w:val="28"/>
+          <w:szCs w:val="24"/>
+        </w:rPr>
+        <w:t>, el tercer d</w:t>
+      </w:r>
+      <w:r>
+        <w:rPr>
+          <w:rFonts w:ascii="Arial" w:hAnsi="Arial" w:cs="Arial"/>
+          <w:sz w:val="28"/>
+          <w:szCs w:val="24"/>
+        </w:rPr>
+        <w:t>í</w:t>
+      </w:r>
+      <w:r>
+        <w:rPr>
+          <w:rFonts w:ascii="Arial" w:hAnsi="Arial" w:cs="Arial"/>
+          <w:sz w:val="28"/>
+          <w:szCs w:val="24"/>
+        </w:rPr>
+        <w:t xml:space="preserve">a tomamos 2 </w:t>
+      </w:r>
+      <w:r>
+        <w:rPr>
+          <w:rFonts w:ascii="Arial" w:hAnsi="Arial" w:cs="Arial"/>
+          <w:sz w:val="28"/>
+          <w:szCs w:val="24"/>
+        </w:rPr>
+        <w:t>cafés</w:t>
+      </w:r>
+      <w:r>
+        <w:rPr>
+          <w:rFonts w:ascii="Arial" w:hAnsi="Arial" w:cs="Arial"/>
+          <w:sz w:val="28"/>
+          <w:szCs w:val="24"/>
+        </w:rPr>
+        <w:t xml:space="preserve"> y un batido de cacao, el precio fue de 2 euros. Justif</w:t>
+      </w:r>
+      <w:r>
+        <w:rPr>
+          <w:rFonts w:ascii="Arial" w:hAnsi="Arial" w:cs="Arial"/>
+          <w:sz w:val="28"/>
+          <w:szCs w:val="24"/>
+        </w:rPr>
+        <w:t>íq</w:t>
+      </w:r>
+      <w:r>
+        <w:rPr>
+          <w:rFonts w:ascii="Arial" w:hAnsi="Arial" w:cs="Arial"/>
+          <w:sz w:val="28"/>
+          <w:szCs w:val="24"/>
+        </w:rPr>
+        <w:t>uese</w:t>
+      </w:r>
+      <w:r>
+        <w:rPr>
+          <w:rFonts w:ascii="Arial" w:hAnsi="Arial" w:cs="Arial"/>
+          <w:sz w:val="28"/>
+          <w:szCs w:val="24"/>
+        </w:rPr>
+        <w:t xml:space="preserve"> </w:t>
+      </w:r>
+      <w:r>
+        <w:rPr>
+          <w:rFonts w:ascii="Arial" w:hAnsi="Arial" w:cs="Arial"/>
+          <w:sz w:val="28"/>
+          <w:szCs w:val="24"/>
+        </w:rPr>
+        <w:t xml:space="preserve">razonadamente si con estos datos podemos determinar o no el precio de un </w:t>
+      </w:r>
+      <w:r>
+        <w:rPr>
+          <w:rFonts w:ascii="Arial" w:hAnsi="Arial" w:cs="Arial"/>
+          <w:sz w:val="28"/>
+          <w:szCs w:val="24"/>
+        </w:rPr>
+        <w:t>café</w:t>
+      </w:r>
+      <w:r>
+        <w:rPr>
+          <w:rFonts w:ascii="Arial" w:hAnsi="Arial" w:cs="Arial"/>
+          <w:sz w:val="28"/>
+          <w:szCs w:val="24"/>
+        </w:rPr>
+        <w:t>, de un refresco de</w:t>
+      </w:r>
+      <w:r>
+        <w:rPr>
+          <w:rFonts w:ascii="Arial" w:hAnsi="Arial" w:cs="Arial"/>
+          <w:sz w:val="28"/>
+          <w:szCs w:val="24"/>
+        </w:rPr>
+        <w:t xml:space="preserve"> </w:t>
+      </w:r>
+      <w:r>
+        <w:rPr>
+          <w:rFonts w:ascii="Arial" w:hAnsi="Arial" w:cs="Arial"/>
+          <w:sz w:val="28"/>
+          <w:szCs w:val="24"/>
+        </w:rPr>
+        <w:t>cola y de un batido de cacao, suponiendo que estos precios no han variado en los tres d</w:t>
+      </w:r>
+      <w:r>
+        <w:rPr>
+          <w:rFonts w:ascii="Arial" w:hAnsi="Arial" w:cs="Arial"/>
+          <w:sz w:val="28"/>
+          <w:szCs w:val="24"/>
+        </w:rPr>
+        <w:t>í</w:t>
+      </w:r>
+      <w:r>
+        <w:rPr>
+          <w:rFonts w:ascii="Arial" w:hAnsi="Arial" w:cs="Arial"/>
+          <w:sz w:val="28"/>
+          <w:szCs w:val="24"/>
+        </w:rPr>
+        <w:t>as.</w:t>
+      </w:r>
+      <w:r>
+        <w:rPr>
+          <w:rFonts w:ascii="Arial" w:hAnsi="Arial" w:cs="Arial"/>
+          <w:sz w:val="28"/>
+          <w:szCs w:val="24"/>
+        </w:rPr>
+        <w:t xml:space="preserve"> </w:t>
+      </w:r>
+      <w:r>
+        <w:rPr>
+          <w:rFonts w:ascii="Arial" w:hAnsi="Arial" w:cs="Arial"/>
+          <w:b/>
+          <w:bCs/>
+          <w:i/>
+          <w:iCs/>
+          <w:sz w:val="28"/>
+          <w:szCs w:val="24"/>
+          <w:lang w:val="es-ES_tradnl"/>
+        </w:rPr>
+        <w:t>(5 pt)</w:t>
+      </w:r>
+    </w:p>
+    <w:p>
+      <w:pPr>
+        <w:pStyle w:val="ListParagraph"/>
+        <w:ind w:left="1080"/>
+        <w:rPr>
+          <w:rFonts w:ascii="Arial" w:hAnsi="Arial" w:cs="Arial"/>
+          <w:sz w:val="28"/>
+          <w:szCs w:val="24"/>
+          <w:lang w:val="es-ES_tradnl"/>
+        </w:rPr>
+      </w:pPr>
+    </w:p>
+    <w:p>
+      <w:pPr>
+        <w:rPr>
+          <w:rFonts w:ascii="Arial" w:hAnsi="Arial" w:cs="Arial"/>
+          <w:sz w:val="28"/>
+          <w:szCs w:val="24"/>
+          <w:lang w:val="es-ES_tradnl"/>
+        </w:rPr>
+      </w:pPr>
+    </w:p>
+    <w:p>
+      <w:pPr>
+        <w:rPr>
+          <w:rFonts w:ascii="Arial" w:hAnsi="Arial" w:cs="Arial"/>
+          <w:sz w:val="28"/>
+          <w:szCs w:val="24"/>
+          <w:lang w:val="es-ES_tradnl"/>
+        </w:rPr>
+      </w:pPr>
     </w:p>
     <w:sectPr>
       <w:pgSz w:w="11906" w:h="16838"/>
@@ -1058,6 +2330,95 @@
     </w:lvl>
   </w:abstractNum>
   <w:abstractNum w:abstractNumId="3" w15:restartNumberingAfterBreak="0">
+    <w:nsid w:val="2AA24676"/>
+    <w:multiLevelType w:val="hybridMultilevel"/>
+    <w:tmpl w:val="B98A7228"/>
+    <w:lvl w:ilvl="0" w:tplc="0C0A0019">
+      <w:start w:val="1"/>
+      <w:numFmt w:val="lowerLetter"/>
+      <w:lvlText w:val="%1."/>
+      <w:lvlJc w:val="left"/>
+      <w:pPr>
+        <w:ind w:left="720" w:hanging="360"/>
+      </w:pPr>
+      <w:rPr>
+        <w:rFonts w:hint="default"/>
+      </w:rPr>
+    </w:lvl>
+    <w:lvl w:ilvl="1" w:tplc="0C0A0019" w:tentative="1">
+      <w:start w:val="1"/>
+      <w:numFmt w:val="lowerLetter"/>
+      <w:lvlText w:val="%2."/>
+      <w:lvlJc w:val="left"/>
+      <w:pPr>
+        <w:ind w:left="1440" w:hanging="360"/>
+      </w:pPr>
+    </w:lvl>
+    <w:lvl w:ilvl="2" w:tplc="0C0A001B" w:tentative="1">
+      <w:start w:val="1"/>
+      <w:numFmt w:val="lowerRoman"/>
+      <w:lvlText w:val="%3."/>
+      <w:lvlJc w:val="right"/>
+      <w:pPr>
+        <w:ind w:left="2160" w:hanging="180"/>
+      </w:pPr>
+    </w:lvl>
+    <w:lvl w:ilvl="3" w:tplc="0C0A000F" w:tentative="1">
+      <w:start w:val="1"/>
+      <w:numFmt w:val="decimal"/>
+      <w:lvlText w:val="%4."/>
+      <w:lvlJc w:val="left"/>
+      <w:pPr>
+        <w:ind w:left="2880" w:hanging="360"/>
+      </w:pPr>
+    </w:lvl>
+    <w:lvl w:ilvl="4" w:tplc="0C0A0019" w:tentative="1">
+      <w:start w:val="1"/>
+      <w:numFmt w:val="lowerLetter"/>
+      <w:lvlText w:val="%5."/>
+      <w:lvlJc w:val="left"/>
+      <w:pPr>
+        <w:ind w:left="3600" w:hanging="360"/>
+      </w:pPr>
+    </w:lvl>
+    <w:lvl w:ilvl="5" w:tplc="0C0A001B" w:tentative="1">
+      <w:start w:val="1"/>
+      <w:numFmt w:val="lowerRoman"/>
+      <w:lvlText w:val="%6."/>
+      <w:lvlJc w:val="right"/>
+      <w:pPr>
+        <w:ind w:left="4320" w:hanging="180"/>
+      </w:pPr>
+    </w:lvl>
+    <w:lvl w:ilvl="6" w:tplc="0C0A000F" w:tentative="1">
+      <w:start w:val="1"/>
+      <w:numFmt w:val="decimal"/>
+      <w:lvlText w:val="%7."/>
+      <w:lvlJc w:val="left"/>
+      <w:pPr>
+        <w:ind w:left="5040" w:hanging="360"/>
+      </w:pPr>
+    </w:lvl>
+    <w:lvl w:ilvl="7" w:tplc="0C0A0019" w:tentative="1">
+      <w:start w:val="1"/>
+      <w:numFmt w:val="lowerLetter"/>
+      <w:lvlText w:val="%8."/>
+      <w:lvlJc w:val="left"/>
+      <w:pPr>
+        <w:ind w:left="5760" w:hanging="360"/>
+      </w:pPr>
+    </w:lvl>
+    <w:lvl w:ilvl="8" w:tplc="0C0A001B" w:tentative="1">
+      <w:start w:val="1"/>
+      <w:numFmt w:val="lowerRoman"/>
+      <w:lvlText w:val="%9."/>
+      <w:lvlJc w:val="right"/>
+      <w:pPr>
+        <w:ind w:left="6480" w:hanging="180"/>
+      </w:pPr>
+    </w:lvl>
+  </w:abstractNum>
+  <w:abstractNum w:abstractNumId="4" w15:restartNumberingAfterBreak="0">
     <w:nsid w:val="2F6614C8"/>
     <w:multiLevelType w:val="hybridMultilevel"/>
     <w:tmpl w:val="EB968672"/>
@@ -1073,7 +2434,7 @@
         <w:rFonts w:hint="default"/>
       </w:rPr>
     </w:lvl>
-    <w:lvl w:ilvl="1" w:tplc="0C0A0019" w:tentative="1">
+    <w:lvl w:ilvl="1" w:tplc="0C0A0019">
       <w:start w:val="1"/>
       <w:numFmt w:val="lowerLetter"/>
       <w:lvlText w:val="%2."/>
@@ -1146,7 +2507,7 @@
       </w:pPr>
     </w:lvl>
   </w:abstractNum>
-  <w:abstractNum w:abstractNumId="4" w15:restartNumberingAfterBreak="0">
+  <w:abstractNum w:abstractNumId="5" w15:restartNumberingAfterBreak="0">
     <w:nsid w:val="322E59D1"/>
     <w:multiLevelType w:val="hybridMultilevel"/>
     <w:tmpl w:val="9DFE97A6"/>
@@ -1235,7 +2596,7 @@
       </w:pPr>
     </w:lvl>
   </w:abstractNum>
-  <w:abstractNum w:abstractNumId="5" w15:restartNumberingAfterBreak="0">
+  <w:abstractNum w:abstractNumId="6" w15:restartNumberingAfterBreak="0">
     <w:nsid w:val="325535FE"/>
     <w:multiLevelType w:val="hybridMultilevel"/>
     <w:tmpl w:val="3FE810F6"/>
@@ -1324,7 +2685,205 @@
       </w:pPr>
     </w:lvl>
   </w:abstractNum>
-  <w:abstractNum w:abstractNumId="6" w15:restartNumberingAfterBreak="0">
+  <w:abstractNum w:abstractNumId="7" w15:restartNumberingAfterBreak="0">
+    <w:nsid w:val="34607BD9"/>
+    <w:multiLevelType w:val="hybridMultilevel"/>
+    <w:tmpl w:val="32207DD8"/>
+    <w:lvl w:ilvl="0" w:tplc="0C0A0019">
+      <w:start w:val="1"/>
+      <w:numFmt w:val="lowerLetter"/>
+      <w:lvlText w:val="%1."/>
+      <w:lvlJc w:val="left"/>
+      <w:pPr>
+        <w:ind w:left="1440" w:hanging="360"/>
+      </w:pPr>
+    </w:lvl>
+    <w:lvl w:ilvl="1" w:tplc="0C0A0019" w:tentative="1">
+      <w:start w:val="1"/>
+      <w:numFmt w:val="lowerLetter"/>
+      <w:lvlText w:val="%2."/>
+      <w:lvlJc w:val="left"/>
+      <w:pPr>
+        <w:ind w:left="2160" w:hanging="360"/>
+      </w:pPr>
+    </w:lvl>
+    <w:lvl w:ilvl="2" w:tplc="0C0A001B" w:tentative="1">
+      <w:start w:val="1"/>
+      <w:numFmt w:val="lowerRoman"/>
+      <w:lvlText w:val="%3."/>
+      <w:lvlJc w:val="right"/>
+      <w:pPr>
+        <w:ind w:left="2880" w:hanging="180"/>
+      </w:pPr>
+    </w:lvl>
+    <w:lvl w:ilvl="3" w:tplc="0C0A000F" w:tentative="1">
+      <w:start w:val="1"/>
+      <w:numFmt w:val="decimal"/>
+      <w:lvlText w:val="%4."/>
+      <w:lvlJc w:val="left"/>
+      <w:pPr>
+        <w:ind w:left="3600" w:hanging="360"/>
+      </w:pPr>
+    </w:lvl>
+    <w:lvl w:ilvl="4" w:tplc="0C0A0019" w:tentative="1">
+      <w:start w:val="1"/>
+      <w:numFmt w:val="lowerLetter"/>
+      <w:lvlText w:val="%5."/>
+      <w:lvlJc w:val="left"/>
+      <w:pPr>
+        <w:ind w:left="4320" w:hanging="360"/>
+      </w:pPr>
+    </w:lvl>
+    <w:lvl w:ilvl="5" w:tplc="0C0A001B" w:tentative="1">
+      <w:start w:val="1"/>
+      <w:numFmt w:val="lowerRoman"/>
+      <w:lvlText w:val="%6."/>
+      <w:lvlJc w:val="right"/>
+      <w:pPr>
+        <w:ind w:left="5040" w:hanging="180"/>
+      </w:pPr>
+    </w:lvl>
+    <w:lvl w:ilvl="6" w:tplc="0C0A000F" w:tentative="1">
+      <w:start w:val="1"/>
+      <w:numFmt w:val="decimal"/>
+      <w:lvlText w:val="%7."/>
+      <w:lvlJc w:val="left"/>
+      <w:pPr>
+        <w:ind w:left="5760" w:hanging="360"/>
+      </w:pPr>
+    </w:lvl>
+    <w:lvl w:ilvl="7" w:tplc="0C0A0019" w:tentative="1">
+      <w:start w:val="1"/>
+      <w:numFmt w:val="lowerLetter"/>
+      <w:lvlText w:val="%8."/>
+      <w:lvlJc w:val="left"/>
+      <w:pPr>
+        <w:ind w:left="6480" w:hanging="360"/>
+      </w:pPr>
+    </w:lvl>
+    <w:lvl w:ilvl="8" w:tplc="0C0A001B" w:tentative="1">
+      <w:start w:val="1"/>
+      <w:numFmt w:val="lowerRoman"/>
+      <w:lvlText w:val="%9."/>
+      <w:lvlJc w:val="right"/>
+      <w:pPr>
+        <w:ind w:left="7200" w:hanging="180"/>
+      </w:pPr>
+    </w:lvl>
+  </w:abstractNum>
+  <w:abstractNum w:abstractNumId="8" w15:restartNumberingAfterBreak="0">
+    <w:nsid w:val="357E6DF9"/>
+    <w:multiLevelType w:val="hybridMultilevel"/>
+    <w:tmpl w:val="408474D8"/>
+    <w:lvl w:ilvl="0" w:tplc="AD1A414A">
+      <w:numFmt w:val="bullet"/>
+      <w:lvlText w:val="-"/>
+      <w:lvlJc w:val="left"/>
+      <w:pPr>
+        <w:ind w:left="1080" w:hanging="360"/>
+      </w:pPr>
+      <w:rPr>
+        <w:rFonts w:ascii="Arial" w:eastAsiaTheme="minorHAnsi" w:hAnsi="Arial" w:cs="Arial" w:hint="default"/>
+      </w:rPr>
+    </w:lvl>
+    <w:lvl w:ilvl="1" w:tplc="0C0A0003" w:tentative="1">
+      <w:start w:val="1"/>
+      <w:numFmt w:val="bullet"/>
+      <w:lvlText w:val="o"/>
+      <w:lvlJc w:val="left"/>
+      <w:pPr>
+        <w:ind w:left="1800" w:hanging="360"/>
+      </w:pPr>
+      <w:rPr>
+        <w:rFonts w:ascii="Courier New" w:hAnsi="Courier New" w:cs="Courier New" w:hint="default"/>
+      </w:rPr>
+    </w:lvl>
+    <w:lvl w:ilvl="2" w:tplc="0C0A0005" w:tentative="1">
+      <w:start w:val="1"/>
+      <w:numFmt w:val="bullet"/>
+      <w:lvlText w:val=""/>
+      <w:lvlJc w:val="left"/>
+      <w:pPr>
+        <w:ind w:left="2520" w:hanging="360"/>
+      </w:pPr>
+      <w:rPr>
+        <w:rFonts w:ascii="Wingdings" w:hAnsi="Wingdings" w:hint="default"/>
+      </w:rPr>
+    </w:lvl>
+    <w:lvl w:ilvl="3" w:tplc="0C0A0001" w:tentative="1">
+      <w:start w:val="1"/>
+      <w:numFmt w:val="bullet"/>
+      <w:lvlText w:val=""/>
+      <w:lvlJc w:val="left"/>
+      <w:pPr>
+        <w:ind w:left="3240" w:hanging="360"/>
+      </w:pPr>
+      <w:rPr>
+        <w:rFonts w:ascii="Symbol" w:hAnsi="Symbol" w:hint="default"/>
+      </w:rPr>
+    </w:lvl>
+    <w:lvl w:ilvl="4" w:tplc="0C0A0003" w:tentative="1">
+      <w:start w:val="1"/>
+      <w:numFmt w:val="bullet"/>
+      <w:lvlText w:val="o"/>
+      <w:lvlJc w:val="left"/>
+      <w:pPr>
+        <w:ind w:left="3960" w:hanging="360"/>
+      </w:pPr>
+      <w:rPr>
+        <w:rFonts w:ascii="Courier New" w:hAnsi="Courier New" w:cs="Courier New" w:hint="default"/>
+      </w:rPr>
+    </w:lvl>
+    <w:lvl w:ilvl="5" w:tplc="0C0A0005" w:tentative="1">
+      <w:start w:val="1"/>
+      <w:numFmt w:val="bullet"/>
+      <w:lvlText w:val=""/>
+      <w:lvlJc w:val="left"/>
+      <w:pPr>
+        <w:ind w:left="4680" w:hanging="360"/>
+      </w:pPr>
+      <w:rPr>
+        <w:rFonts w:ascii="Wingdings" w:hAnsi="Wingdings" w:hint="default"/>
+      </w:rPr>
+    </w:lvl>
+    <w:lvl w:ilvl="6" w:tplc="0C0A0001" w:tentative="1">
+      <w:start w:val="1"/>
+      <w:numFmt w:val="bullet"/>
+      <w:lvlText w:val=""/>
+      <w:lvlJc w:val="left"/>
+      <w:pPr>
+        <w:ind w:left="5400" w:hanging="360"/>
+      </w:pPr>
+      <w:rPr>
+        <w:rFonts w:ascii="Symbol" w:hAnsi="Symbol" w:hint="default"/>
+      </w:rPr>
+    </w:lvl>
+    <w:lvl w:ilvl="7" w:tplc="0C0A0003" w:tentative="1">
+      <w:start w:val="1"/>
+      <w:numFmt w:val="bullet"/>
+      <w:lvlText w:val="o"/>
+      <w:lvlJc w:val="left"/>
+      <w:pPr>
+        <w:ind w:left="6120" w:hanging="360"/>
+      </w:pPr>
+      <w:rPr>
+        <w:rFonts w:ascii="Courier New" w:hAnsi="Courier New" w:cs="Courier New" w:hint="default"/>
+      </w:rPr>
+    </w:lvl>
+    <w:lvl w:ilvl="8" w:tplc="0C0A0005" w:tentative="1">
+      <w:start w:val="1"/>
+      <w:numFmt w:val="bullet"/>
+      <w:lvlText w:val=""/>
+      <w:lvlJc w:val="left"/>
+      <w:pPr>
+        <w:ind w:left="6840" w:hanging="360"/>
+      </w:pPr>
+      <w:rPr>
+        <w:rFonts w:ascii="Wingdings" w:hAnsi="Wingdings" w:hint="default"/>
+      </w:rPr>
+    </w:lvl>
+  </w:abstractNum>
+  <w:abstractNum w:abstractNumId="9" w15:restartNumberingAfterBreak="0">
     <w:nsid w:val="360B73B9"/>
     <w:multiLevelType w:val="hybridMultilevel"/>
     <w:tmpl w:val="32B83144"/>
@@ -1413,7 +2972,7 @@
       </w:pPr>
     </w:lvl>
   </w:abstractNum>
-  <w:abstractNum w:abstractNumId="7" w15:restartNumberingAfterBreak="0">
+  <w:abstractNum w:abstractNumId="10" w15:restartNumberingAfterBreak="0">
     <w:nsid w:val="3A895686"/>
     <w:multiLevelType w:val="hybridMultilevel"/>
     <w:tmpl w:val="44144226"/>
@@ -1502,7 +3061,7 @@
       </w:pPr>
     </w:lvl>
   </w:abstractNum>
-  <w:abstractNum w:abstractNumId="8" w15:restartNumberingAfterBreak="0">
+  <w:abstractNum w:abstractNumId="11" w15:restartNumberingAfterBreak="0">
     <w:nsid w:val="458A7C90"/>
     <w:multiLevelType w:val="hybridMultilevel"/>
     <w:tmpl w:val="9DFE97A6"/>
@@ -1591,7 +3150,7 @@
       </w:pPr>
     </w:lvl>
   </w:abstractNum>
-  <w:abstractNum w:abstractNumId="9" w15:restartNumberingAfterBreak="0">
+  <w:abstractNum w:abstractNumId="12" w15:restartNumberingAfterBreak="0">
     <w:nsid w:val="49F74F33"/>
     <w:multiLevelType w:val="hybridMultilevel"/>
     <w:tmpl w:val="809425FC"/>
@@ -1680,7 +3239,96 @@
       </w:pPr>
     </w:lvl>
   </w:abstractNum>
-  <w:abstractNum w:abstractNumId="10" w15:restartNumberingAfterBreak="0">
+  <w:abstractNum w:abstractNumId="13" w15:restartNumberingAfterBreak="0">
+    <w:nsid w:val="5E147F45"/>
+    <w:multiLevelType w:val="hybridMultilevel"/>
+    <w:tmpl w:val="299EF352"/>
+    <w:lvl w:ilvl="0" w:tplc="0C0A000F">
+      <w:start w:val="1"/>
+      <w:numFmt w:val="decimal"/>
+      <w:lvlText w:val="%1."/>
+      <w:lvlJc w:val="left"/>
+      <w:pPr>
+        <w:ind w:left="720" w:hanging="360"/>
+      </w:pPr>
+      <w:rPr>
+        <w:rFonts w:hint="default"/>
+      </w:rPr>
+    </w:lvl>
+    <w:lvl w:ilvl="1" w:tplc="0C0A0019">
+      <w:start w:val="1"/>
+      <w:numFmt w:val="lowerLetter"/>
+      <w:lvlText w:val="%2."/>
+      <w:lvlJc w:val="left"/>
+      <w:pPr>
+        <w:ind w:left="1440" w:hanging="360"/>
+      </w:pPr>
+    </w:lvl>
+    <w:lvl w:ilvl="2" w:tplc="0C0A001B" w:tentative="1">
+      <w:start w:val="1"/>
+      <w:numFmt w:val="lowerRoman"/>
+      <w:lvlText w:val="%3."/>
+      <w:lvlJc w:val="right"/>
+      <w:pPr>
+        <w:ind w:left="2160" w:hanging="180"/>
+      </w:pPr>
+    </w:lvl>
+    <w:lvl w:ilvl="3" w:tplc="0C0A000F" w:tentative="1">
+      <w:start w:val="1"/>
+      <w:numFmt w:val="decimal"/>
+      <w:lvlText w:val="%4."/>
+      <w:lvlJc w:val="left"/>
+      <w:pPr>
+        <w:ind w:left="2880" w:hanging="360"/>
+      </w:pPr>
+    </w:lvl>
+    <w:lvl w:ilvl="4" w:tplc="0C0A0019" w:tentative="1">
+      <w:start w:val="1"/>
+      <w:numFmt w:val="lowerLetter"/>
+      <w:lvlText w:val="%5."/>
+      <w:lvlJc w:val="left"/>
+      <w:pPr>
+        <w:ind w:left="3600" w:hanging="360"/>
+      </w:pPr>
+    </w:lvl>
+    <w:lvl w:ilvl="5" w:tplc="0C0A001B" w:tentative="1">
+      <w:start w:val="1"/>
+      <w:numFmt w:val="lowerRoman"/>
+      <w:lvlText w:val="%6."/>
+      <w:lvlJc w:val="right"/>
+      <w:pPr>
+        <w:ind w:left="4320" w:hanging="180"/>
+      </w:pPr>
+    </w:lvl>
+    <w:lvl w:ilvl="6" w:tplc="0C0A000F" w:tentative="1">
+      <w:start w:val="1"/>
+      <w:numFmt w:val="decimal"/>
+      <w:lvlText w:val="%7."/>
+      <w:lvlJc w:val="left"/>
+      <w:pPr>
+        <w:ind w:left="5040" w:hanging="360"/>
+      </w:pPr>
+    </w:lvl>
+    <w:lvl w:ilvl="7" w:tplc="0C0A0019" w:tentative="1">
+      <w:start w:val="1"/>
+      <w:numFmt w:val="lowerLetter"/>
+      <w:lvlText w:val="%8."/>
+      <w:lvlJc w:val="left"/>
+      <w:pPr>
+        <w:ind w:left="5760" w:hanging="360"/>
+      </w:pPr>
+    </w:lvl>
+    <w:lvl w:ilvl="8" w:tplc="0C0A001B" w:tentative="1">
+      <w:start w:val="1"/>
+      <w:numFmt w:val="lowerRoman"/>
+      <w:lvlText w:val="%9."/>
+      <w:lvlJc w:val="right"/>
+      <w:pPr>
+        <w:ind w:left="6480" w:hanging="180"/>
+      </w:pPr>
+    </w:lvl>
+  </w:abstractNum>
+  <w:abstractNum w:abstractNumId="14" w15:restartNumberingAfterBreak="0">
     <w:nsid w:val="65DA1D96"/>
     <w:multiLevelType w:val="hybridMultilevel"/>
     <w:tmpl w:val="D0A4DF8A"/>
@@ -1769,7 +3417,7 @@
       </w:pPr>
     </w:lvl>
   </w:abstractNum>
-  <w:abstractNum w:abstractNumId="11" w15:restartNumberingAfterBreak="0">
+  <w:abstractNum w:abstractNumId="15" w15:restartNumberingAfterBreak="0">
     <w:nsid w:val="70BF2DB1"/>
     <w:multiLevelType w:val="hybridMultilevel"/>
     <w:tmpl w:val="84BC9020"/>
@@ -1882,7 +3530,7 @@
       </w:rPr>
     </w:lvl>
   </w:abstractNum>
-  <w:abstractNum w:abstractNumId="12" w15:restartNumberingAfterBreak="0">
+  <w:abstractNum w:abstractNumId="16" w15:restartNumberingAfterBreak="0">
     <w:nsid w:val="75C71A0F"/>
     <w:multiLevelType w:val="hybridMultilevel"/>
     <w:tmpl w:val="809425FC"/>
@@ -1971,7 +3619,7 @@
       </w:pPr>
     </w:lvl>
   </w:abstractNum>
-  <w:abstractNum w:abstractNumId="13" w15:restartNumberingAfterBreak="0">
+  <w:abstractNum w:abstractNumId="17" w15:restartNumberingAfterBreak="0">
     <w:nsid w:val="7EC344E9"/>
     <w:multiLevelType w:val="hybridMultilevel"/>
     <w:tmpl w:val="532E9BC6"/>
@@ -2061,19 +3709,19 @@
     </w:lvl>
   </w:abstractNum>
   <w:num w:numId="1" w16cid:durableId="672955380">
-    <w:abstractNumId w:val="13"/>
+    <w:abstractNumId w:val="17"/>
   </w:num>
   <w:num w:numId="2" w16cid:durableId="1026370488">
     <w:abstractNumId w:val="0"/>
   </w:num>
   <w:num w:numId="3" w16cid:durableId="1443262870">
-    <w:abstractNumId w:val="9"/>
+    <w:abstractNumId w:val="12"/>
   </w:num>
   <w:num w:numId="4" w16cid:durableId="1991011018">
-    <w:abstractNumId w:val="12"/>
+    <w:abstractNumId w:val="16"/>
   </w:num>
   <w:num w:numId="5" w16cid:durableId="1509638653">
-    <w:abstractNumId w:val="10"/>
+    <w:abstractNumId w:val="14"/>
   </w:num>
   <w:num w:numId="6" w16cid:durableId="943153707">
     <w:abstractNumId w:val="2"/>
@@ -2082,24 +3730,36 @@
     <w:abstractNumId w:val="1"/>
   </w:num>
   <w:num w:numId="8" w16cid:durableId="1085154257">
+    <w:abstractNumId w:val="10"/>
+  </w:num>
+  <w:num w:numId="9" w16cid:durableId="1271282161">
+    <w:abstractNumId w:val="6"/>
+  </w:num>
+  <w:num w:numId="10" w16cid:durableId="829640183">
+    <w:abstractNumId w:val="11"/>
+  </w:num>
+  <w:num w:numId="11" w16cid:durableId="1197767182">
+    <w:abstractNumId w:val="9"/>
+  </w:num>
+  <w:num w:numId="12" w16cid:durableId="732578365">
+    <w:abstractNumId w:val="15"/>
+  </w:num>
+  <w:num w:numId="13" w16cid:durableId="1590237569">
+    <w:abstractNumId w:val="5"/>
+  </w:num>
+  <w:num w:numId="14" w16cid:durableId="1579946494">
+    <w:abstractNumId w:val="4"/>
+  </w:num>
+  <w:num w:numId="15" w16cid:durableId="1160584372">
+    <w:abstractNumId w:val="8"/>
+  </w:num>
+  <w:num w:numId="16" w16cid:durableId="1315839175">
     <w:abstractNumId w:val="7"/>
   </w:num>
-  <w:num w:numId="9" w16cid:durableId="1271282161">
-    <w:abstractNumId w:val="5"/>
+  <w:num w:numId="17" w16cid:durableId="1967270864">
+    <w:abstractNumId w:val="13"/>
   </w:num>
-  <w:num w:numId="10" w16cid:durableId="829640183">
-    <w:abstractNumId w:val="8"/>
-  </w:num>
-  <w:num w:numId="11" w16cid:durableId="1197767182">
-    <w:abstractNumId w:val="6"/>
-  </w:num>
-  <w:num w:numId="12" w16cid:durableId="732578365">
-    <w:abstractNumId w:val="11"/>
-  </w:num>
-  <w:num w:numId="13" w16cid:durableId="1590237569">
-    <w:abstractNumId w:val="4"/>
-  </w:num>
-  <w:num w:numId="14" w16cid:durableId="1579946494">
+  <w:num w:numId="18" w16cid:durableId="2081444704">
     <w:abstractNumId w:val="3"/>
   </w:num>
 </w:numbering>
@@ -2508,7 +4168,6 @@
   <w:style w:type="character" w:default="1" w:styleId="DefaultParagraphFont">
     <w:name w:val="Default Paragraph Font"/>
     <w:uiPriority w:val="1"/>
-    <w:semiHidden/>
     <w:unhideWhenUsed/>
   </w:style>
   <w:style w:type="table" w:default="1" w:styleId="TableNormal">

</xml_diff>